<commit_message>
Resume: Cyber Threat Intelligence Analyst @ Unknown (unknown)
</commit_message>
<xml_diff>
--- a/resumes/Resume_Cyber_Threat_Intelligence_Analyst_Unknown__unknown_.docx
+++ b/resumes/Resume_Cyber_Threat_Intelligence_Analyst_Unknown__unknown_.docx
@@ -117,7 +117,7 @@
         <w:pBdr>
           <w:bottom w:val="single" w:sz="6" w:space="1" w:color="000000"/>
         </w:pBdr>
-        <w:spacing w:before="70" w:after="0"/>
+        <w:spacing w:before="42" w:after="0"/>
       </w:pPr>
       <w:r>
         <w:rPr>
@@ -295,7 +295,7 @@
     </w:p>
     <w:p>
       <w:pPr>
-        <w:spacing w:before="13" w:after="13"/>
+        <w:spacing w:before="5" w:after="5"/>
       </w:pPr>
     </w:p>
     <w:p>
@@ -303,7 +303,7 @@
         <w:pBdr>
           <w:bottom w:val="single" w:sz="6" w:space="1" w:color="000000"/>
         </w:pBdr>
-        <w:spacing w:before="70" w:after="0"/>
+        <w:spacing w:before="42" w:after="0"/>
       </w:pPr>
       <w:r>
         <w:rPr>
@@ -421,7 +421,7 @@
           <w:ilvl w:val="0"/>
           <w:numId w:val="2"/>
         </w:numPr>
-        <w:spacing w:before="13" w:after="23"/>
+        <w:spacing w:before="13" w:after="18"/>
       </w:pPr>
       <w:r>
         <w:rPr>
@@ -440,7 +440,7 @@
           <w:ilvl w:val="0"/>
           <w:numId w:val="2"/>
         </w:numPr>
-        <w:spacing w:before="13" w:after="23"/>
+        <w:spacing w:before="13" w:after="18"/>
       </w:pPr>
       <w:r>
         <w:rPr>
@@ -459,7 +459,7 @@
           <w:ilvl w:val="0"/>
           <w:numId w:val="2"/>
         </w:numPr>
-        <w:spacing w:before="13" w:after="23"/>
+        <w:spacing w:before="13" w:after="18"/>
       </w:pPr>
       <w:r>
         <w:rPr>
@@ -478,7 +478,7 @@
           <w:ilvl w:val="0"/>
           <w:numId w:val="2"/>
         </w:numPr>
-        <w:spacing w:before="13" w:after="23"/>
+        <w:spacing w:before="13" w:after="18"/>
       </w:pPr>
       <w:r>
         <w:rPr>
@@ -495,7 +495,7 @@
         <w:pBdr>
           <w:bottom w:val="single" w:sz="6" w:space="1" w:color="000000"/>
         </w:pBdr>
-        <w:spacing w:before="13" w:after="13"/>
+        <w:spacing w:before="5" w:after="5"/>
         <w:rPr>
           <w:rFonts w:ascii="Source Sans Pro" w:eastAsia="Source Sans Pro" w:hAnsi="Source Sans Pro" w:cs="Source Sans Pro"/>
           <w:b/>
@@ -511,7 +511,7 @@
         <w:pBdr>
           <w:bottom w:val="single" w:sz="6" w:space="1" w:color="000000"/>
         </w:pBdr>
-        <w:spacing w:before="70" w:after="0"/>
+        <w:spacing w:before="42" w:after="0"/>
       </w:pPr>
       <w:r>
         <w:rPr>
@@ -579,16 +579,16 @@
           <w:ilvl w:val="0"/>
           <w:numId w:val="2"/>
         </w:numPr>
-        <w:spacing w:before="13" w:after="23"/>
-      </w:pPr>
-      <w:r>
-        <w:rPr>
-          <w:rFonts w:ascii="Source Sans Pro" w:eastAsia="Source Sans Pro" w:hAnsi="Source Sans Pro" w:cs="Source Sans Pro"/>
-          <w:color w:val="000000"/>
-          <w:sz w:val="19"/>
-          <w:szCs w:val="19"/>
-        </w:rPr>
-        <w:t>Deployed Splunk SIEM with SPL searches for brute-force detection, lateral movement, and privilege escalation; mapped TTPs to MITRE ATT&amp;CK and wrote PICERL incident report for FIRST.org.</w:t>
+        <w:spacing w:before="13" w:after="18"/>
+      </w:pPr>
+      <w:r>
+        <w:rPr>
+          <w:rFonts w:ascii="Source Sans Pro" w:eastAsia="Source Sans Pro" w:hAnsi="Source Sans Pro" w:cs="Source Sans Pro"/>
+          <w:color w:val="000000"/>
+          <w:sz w:val="19"/>
+          <w:szCs w:val="19"/>
+        </w:rPr>
+        <w:t>Deployed Splunk SIEM with SPL correlation searches for brute-force detection, lateral movement, and privilege escalation, mapped to MITRE ATT&amp;CK TTPs and created PICERL incident reports.</w:t>
       </w:r>
     </w:p>
     <w:p>
@@ -598,16 +598,16 @@
           <w:ilvl w:val="0"/>
           <w:numId w:val="2"/>
         </w:numPr>
-        <w:spacing w:before="13" w:after="23"/>
-      </w:pPr>
-      <w:r>
-        <w:rPr>
-          <w:rFonts w:ascii="Source Sans Pro" w:eastAsia="Source Sans Pro" w:hAnsi="Source Sans Pro" w:cs="Source Sans Pro"/>
-          <w:color w:val="000000"/>
-          <w:sz w:val="19"/>
-          <w:szCs w:val="19"/>
-        </w:rPr>
-        <w:t>Developed SOAR-style detection pipeline using Python, ingesting Splunk alerts, enriching with VirusTotal API, and dispatching Telegram notifications with severity classification.</w:t>
+        <w:spacing w:before="13" w:after="18"/>
+      </w:pPr>
+      <w:r>
+        <w:rPr>
+          <w:rFonts w:ascii="Source Sans Pro" w:eastAsia="Source Sans Pro" w:hAnsi="Source Sans Pro" w:cs="Source Sans Pro"/>
+          <w:color w:val="000000"/>
+          <w:sz w:val="19"/>
+          <w:szCs w:val="19"/>
+        </w:rPr>
+        <w:t>Developed SOAR-style detection pipeline: Python script ingests Splunk alerts, enriches with VirusTotal API, and dispatches Telegram notifications with severity classification.</w:t>
       </w:r>
     </w:p>
     <w:p>
@@ -617,21 +617,21 @@
           <w:ilvl w:val="0"/>
           <w:numId w:val="2"/>
         </w:numPr>
-        <w:spacing w:before="13" w:after="23"/>
-      </w:pPr>
-      <w:r>
-        <w:rPr>
-          <w:rFonts w:ascii="Source Sans Pro" w:eastAsia="Source Sans Pro" w:hAnsi="Source Sans Pro" w:cs="Source Sans Pro"/>
-          <w:color w:val="000000"/>
-          <w:sz w:val="19"/>
-          <w:szCs w:val="19"/>
-        </w:rPr>
-        <w:t>Converted detection logic to Sigma rules (detection-as-code) for enterprise SOCs; analyzed TCP/IP in Wireshark for SYN scans, DNS tunnelling, and plaintext credential exposure.</w:t>
-      </w:r>
-    </w:p>
-    <w:p>
-      <w:pPr>
-        <w:spacing w:before="13" w:after="13"/>
+        <w:spacing w:before="13" w:after="18"/>
+      </w:pPr>
+      <w:r>
+        <w:rPr>
+          <w:rFonts w:ascii="Source Sans Pro" w:eastAsia="Source Sans Pro" w:hAnsi="Source Sans Pro" w:cs="Source Sans Pro"/>
+          <w:color w:val="000000"/>
+          <w:sz w:val="19"/>
+          <w:szCs w:val="19"/>
+        </w:rPr>
+        <w:t>Converted detection logic to Sigma rules; analyzed TCP/IP traffic in Wireshark for SYN scans, DNS tunnelling, and plaintext credential exposure.</w:t>
+      </w:r>
+    </w:p>
+    <w:p>
+      <w:pPr>
+        <w:spacing w:before="5" w:after="5"/>
       </w:pPr>
     </w:p>
     <w:p>
@@ -688,16 +688,16 @@
           <w:ilvl w:val="0"/>
           <w:numId w:val="2"/>
         </w:numPr>
-        <w:spacing w:before="13" w:after="23"/>
-      </w:pPr>
-      <w:r>
-        <w:rPr>
-          <w:rFonts w:ascii="Source Sans Pro" w:eastAsia="Source Sans Pro" w:hAnsi="Source Sans Pro" w:cs="Source Sans Pro"/>
-          <w:color w:val="000000"/>
-          <w:sz w:val="19"/>
-          <w:szCs w:val="19"/>
-        </w:rPr>
-        <w:t>Built automated vulnerability assessment pipeline integrating Nessus and OpenVAS REST APIs in Python; generated CVE reports classified by CVSS severity (vulnerability prioritisation) and EPSS context from the FIRST.org API.</w:t>
+        <w:spacing w:before="13" w:after="18"/>
+      </w:pPr>
+      <w:r>
+        <w:rPr>
+          <w:rFonts w:ascii="Source Sans Pro" w:eastAsia="Source Sans Pro" w:hAnsi="Source Sans Pro" w:cs="Source Sans Pro"/>
+          <w:color w:val="000000"/>
+          <w:sz w:val="19"/>
+          <w:szCs w:val="19"/>
+        </w:rPr>
+        <w:t>Developed automated vulnerability assessment pipeline integrating Nessus and OpenVAS REST APIs in Python, generating CVE reports with CVSS severity and EPSS context from FIRST.org API.</w:t>
       </w:r>
     </w:p>
     <w:p>
@@ -707,16 +707,16 @@
           <w:ilvl w:val="0"/>
           <w:numId w:val="2"/>
         </w:numPr>
-        <w:spacing w:before="13" w:after="23"/>
-      </w:pPr>
-      <w:r>
-        <w:rPr>
-          <w:rFonts w:ascii="Source Sans Pro" w:eastAsia="Source Sans Pro" w:hAnsi="Source Sans Pro" w:cs="Source Sans Pro"/>
-          <w:color w:val="000000"/>
-          <w:sz w:val="19"/>
-          <w:szCs w:val="19"/>
-        </w:rPr>
-        <w:t>Developed OWASP Top 10 automated web checker to detect web app vulnerabilities, including injection, auth, and SSRF; documented SQL injection exploit remediation.</w:t>
+        <w:spacing w:before="13" w:after="18"/>
+      </w:pPr>
+      <w:r>
+        <w:rPr>
+          <w:rFonts w:ascii="Source Sans Pro" w:eastAsia="Source Sans Pro" w:hAnsi="Source Sans Pro" w:cs="Source Sans Pro"/>
+          <w:color w:val="000000"/>
+          <w:sz w:val="19"/>
+          <w:szCs w:val="19"/>
+        </w:rPr>
+        <w:t>Developed OWASP Top 10 (web application security) automated web checker that sends crafted HTTP requests to detect injection, broken auth, and SSRF vulnerabilities; documented SQL injection exploit and parameterised query remediation.</w:t>
       </w:r>
     </w:p>
     <w:p>
@@ -726,7 +726,7 @@
           <w:ilvl w:val="0"/>
           <w:numId w:val="2"/>
         </w:numPr>
-        <w:spacing w:before="13" w:after="23"/>
+        <w:spacing w:before="13" w:after="18"/>
       </w:pPr>
       <w:r>
         <w:rPr>
@@ -743,7 +743,7 @@
         <w:pBdr>
           <w:bottom w:val="single" w:sz="6" w:space="1" w:color="000000"/>
         </w:pBdr>
-        <w:spacing w:before="13" w:after="13"/>
+        <w:spacing w:before="5" w:after="5"/>
         <w:rPr>
           <w:rFonts w:ascii="Source Sans Pro" w:eastAsia="Source Sans Pro" w:hAnsi="Source Sans Pro" w:cs="Source Sans Pro"/>
           <w:b/>
@@ -759,7 +759,7 @@
         <w:pBdr>
           <w:bottom w:val="single" w:sz="6" w:space="1" w:color="000000"/>
         </w:pBdr>
-        <w:spacing w:before="70" w:after="0"/>
+        <w:spacing w:before="42" w:after="0"/>
       </w:pPr>
       <w:r>
         <w:rPr>
@@ -775,7 +775,7 @@
     </w:p>
     <w:p>
       <w:pPr>
-        <w:spacing w:before="37" w:after="37"/>
+        <w:spacing w:before="29" w:after="29"/>
       </w:pPr>
       <w:r>
         <w:rPr>
@@ -797,7 +797,7 @@
     </w:p>
     <w:p>
       <w:pPr>
-        <w:spacing w:before="37" w:after="37"/>
+        <w:spacing w:before="29" w:after="29"/>
       </w:pPr>
       <w:r>
         <w:rPr>
@@ -819,7 +819,7 @@
     </w:p>
     <w:p>
       <w:pPr>
-        <w:spacing w:before="37" w:after="37"/>
+        <w:spacing w:before="29" w:after="29"/>
       </w:pPr>
       <w:r>
         <w:rPr>
@@ -841,7 +841,7 @@
     </w:p>
     <w:p>
       <w:pPr>
-        <w:spacing w:before="37" w:after="37"/>
+        <w:spacing w:before="29" w:after="29"/>
       </w:pPr>
       <w:r>
         <w:rPr>
@@ -863,7 +863,7 @@
     </w:p>
     <w:p>
       <w:pPr>
-        <w:spacing w:before="37" w:after="37"/>
+        <w:spacing w:before="29" w:after="29"/>
       </w:pPr>
       <w:r>
         <w:rPr>
@@ -888,7 +888,7 @@
         <w:pBdr>
           <w:bottom w:val="single" w:sz="6" w:space="1" w:color="000000"/>
         </w:pBdr>
-        <w:spacing w:before="13" w:after="13"/>
+        <w:spacing w:before="5" w:after="5"/>
         <w:rPr>
           <w:rFonts w:ascii="Source Sans Pro" w:eastAsia="Source Sans Pro" w:hAnsi="Source Sans Pro" w:cs="Source Sans Pro"/>
           <w:b/>
@@ -904,7 +904,7 @@
         <w:pBdr>
           <w:bottom w:val="single" w:sz="6" w:space="1" w:color="000000"/>
         </w:pBdr>
-        <w:spacing w:before="70" w:after="0"/>
+        <w:spacing w:before="42" w:after="0"/>
       </w:pPr>
       <w:r>
         <w:rPr>
@@ -925,7 +925,7 @@
           <w:ilvl w:val="0"/>
           <w:numId w:val="2"/>
         </w:numPr>
-        <w:spacing w:before="13" w:after="23"/>
+        <w:spacing w:before="13" w:after="18"/>
       </w:pPr>
       <w:r>
         <w:rPr>
@@ -944,7 +944,7 @@
           <w:ilvl w:val="0"/>
           <w:numId w:val="2"/>
         </w:numPr>
-        <w:spacing w:before="13" w:after="23"/>
+        <w:spacing w:before="13" w:after="18"/>
       </w:pPr>
       <w:r>
         <w:rPr>

</xml_diff>